<commit_message>
shortened class comments and removed leftover patterns page
</commit_message>
<xml_diff>
--- a/docs/report/CIS6003_WRIT1_Sunrise_Clinic_Report.docx
+++ b/docs/report/CIS6003_WRIT1_Sunrise_Clinic_Report.docx
@@ -1170,7 +1170,7 @@
           <w:color w:val="000000"/>
           <w:sz w:val="24"/>
         </w:rPr>
-        <w:t>Table 1 is the same plan in one place. Every commit maps to a real file in the repo. There is no day for "AI chatbot" or "inventory of toothpaste".</w:t>
+        <w:t>Table 1 is the same plan in one place. Every commit maps to a real file in the repo. I did not add extras that are not part of this clinic.</w:t>
       </w:r>
     </w:p>
     <w:tbl>
@@ -8820,7 +8820,7 @@
           <w:color w:val="000000"/>
           <w:sz w:val="24"/>
         </w:rPr>
-        <w:t>I did not list a mobile game, an AI chatbot, or a stock system for toothpaste. Those would break the consistency rule. If a future feature cannot point back to an actor or a table I already have, I will not put it on a slide.</w:t>
+        <w:t>I did not add extras that are not part of this clinic. If a future feature cannot point back to an actor or a table I already have, I will not put it on a slide.</w:t>
       </w:r>
     </w:p>
     <w:p>

</xml_diff>